<commit_message>
LA MARQUE 3부: rename Dr Vasseur to Courtois and Annecy doctor Morel to Pujol (name clashes)
Co-Authored-By: Claude Opus 5.5 <noreply@anthropic.com>
Claude-Session: https://claude.ai/code/session_01N4vhCLeYxrjvGnDxQBD9Cq
</commit_message>
<xml_diff>
--- a/la-marque/대본/3부/02화_Les_leaders_d_opinion.docx
+++ b/la-marque/대본/3부/02화_Les_leaders_d_opinion.docx
@@ -62,7 +62,7 @@
         <w:t xml:space="preserve"> </w:t>
       </w:r>
       <w:r>
-        <w:t xml:space="preserve">- 등장인물: Clémence, Bastien, Inès, Dr Hélène Fabre(의장), Dr Anne Vasseur(릴 피부과), Dr Hakim Benchetrit(마르세유 성형외과), Dr Pierre Morand(클뤼즈 피부과)</w:t>
+        <w:t xml:space="preserve">- 등장인물: Clémence, Bastien, Inès, Dr Hélène Fabre(의장), Dr Anne Courtois(릴 피부과), Dr Hakim Benchetrit(마르세유 성형외과), Dr Pierre Morand(클뤼즈 피부과)</w:t>
       </w:r>
       <w:r>
         <w:t xml:space="preserve"> </w:t>
@@ -265,7 +265,7 @@
           <w:bCs/>
           <w:b/>
         </w:rPr>
-        <w:t xml:space="preserve">위원: 안 바쇠르(릴, 15년, 이상 반응 숨긴 회사 거절, 스위스 브랜드 컨설턴트 — 신고 조건) / 아킴 벤셰트리(마르세유 성형외과, 고령·남성 환자, 발표 사전 검토 요구한 위원회 탈퇴) / 피에르 모랑(클뤼즈, 클레망스 어머니 주치의 — 관계 신고) + 파브르 의장 = 5인</w:t>
+        <w:t xml:space="preserve">위원: 안 쿠르투아(릴, 15년, 이상 반응 숨긴 회사 거절, 스위스 브랜드 컨설턴트 — 신고 조건) / 아킴 벤셰트리(마르세유 성형외과, 고령·남성 환자, 발표 사전 검토 요구한 위원회 탈퇴) / 피에르 모랑(클뤼즈, 클레망스 어머니 주치의 — 관계 신고) + 파브르 의장 = 5인</w:t>
       </w:r>
       <w:r>
         <w:t xml:space="preserve"> </w:t>
@@ -353,7 +353,7 @@
           <w:bCs/>
           <w:b/>
         </w:rPr>
-        <w:t xml:space="preserve">첫 회의: 관계 낭독(파브르: 레지스트리 보수, 6년간 다른 관계 없음) → 바쇠르</w:t>
+        <w:t xml:space="preserve">첫 회의: 관계 낭독(파브르: 레지스트리 보수, 6년간 다른 관계 없음) → 쿠르투아</w:t>
       </w:r>
       <w:r>
         <w:rPr>
@@ -395,7 +395,7 @@
           <w:bCs/>
           <w:b/>
         </w:rPr>
-        <w:t xml:space="preserve">→ 코팅한 1쪽 응급 안내문을 모든 상자에(바스티앵+카미유 작성, 바쇠르 무료 검토) / 벤셰트리</w:t>
+        <w:t xml:space="preserve">→ 코팅한 1쪽 응급 안내문을 모든 상자에(바스티앵+카미유 작성, 쿠르투아 무료 검토) / 벤셰트리</w:t>
       </w:r>
       <w:r>
         <w:rPr>
@@ -956,7 +956,7 @@
         <w:pStyle w:val="BodyText"/>
       </w:pPr>
       <w:r>
-        <w:t xml:space="preserve">INES: Docteure Anne Vasseur. Dermatologue à Lille. Quinze ans de pratique. Elle injecte trois jours par semaine.</w:t>
+        <w:t xml:space="preserve">INES: Docteure Anne Courtois. Dermatologue à Lille. Quinze ans de pratique. Elle injecte trois jours par semaine.</w:t>
       </w:r>
     </w:p>
     <w:p>
@@ -1408,7 +1408,7 @@
         <w:pStyle w:val="BodyText"/>
       </w:pPr>
       <w:r>
-        <w:t xml:space="preserve">VASSEUR: Anne Vasseur, Lille. Consultante pour une marque suisse depuis deux ans. Je l’ai dit, je le redis.</w:t>
+        <w:t xml:space="preserve">COURTOIS: Anne Courtois, Lille. Consultante pour une marque suisse depuis deux ans. Je l’ai dit, je le redis.</w:t>
       </w:r>
     </w:p>
     <w:p>
@@ -1448,7 +1448,7 @@
         <w:pStyle w:val="BodyText"/>
       </w:pPr>
       <w:r>
-        <w:t xml:space="preserve">VASSEUR: Alors je commence par le désagréable. Votre notice est trop longue pour être lue, et trop courte sur ce qui compte : l’occlusion vasculaire. C’est ce qui tue, ou ce qui sauve.</w:t>
+        <w:t xml:space="preserve">COURTOIS: Alors je commence par le désagréable. Votre notice est trop longue pour être lue, et trop courte sur ce qui compte : l’occlusion vasculaire. C’est ce qui tue, ou ce qui sauve.</w:t>
       </w:r>
     </w:p>
     <w:p>
@@ -1464,7 +1464,7 @@
         <w:pStyle w:val="BodyText"/>
       </w:pPr>
       <w:r>
-        <w:t xml:space="preserve">VASSEUR: Les exigences, oui. Mais un jeune médecin, le soir, avec une patiente qui a mal, il veut une page claire. Quels signes, quoi faire, dans quel ordre. Pas un paragraphe juridique.</w:t>
+        <w:t xml:space="preserve">COURTOIS: Les exigences, oui. Mais un jeune médecin, le soir, avec une patiente qui a mal, il veut une page claire. Quels signes, quoi faire, dans quel ordre. Pas un paragraphe juridique.</w:t>
       </w:r>
     </w:p>
     <w:p>
@@ -1488,15 +1488,15 @@
         <w:pStyle w:val="BodyText"/>
       </w:pPr>
       <w:r>
-        <w:t xml:space="preserve">BASTIEN: Je la rédige avec Camille. Et vous la relisez, docteure Vasseur.</w:t>
-      </w:r>
-    </w:p>
-    <w:p>
-      <w:pPr>
-        <w:pStyle w:val="BodyText"/>
-      </w:pPr>
-      <w:r>
-        <w:t xml:space="preserve">VASSEUR: Avec plaisir. Gratuitement, pour celle-là.</w:t>
+        <w:t xml:space="preserve">BASTIEN: Je la rédige avec Camille. Et vous la relisez, docteure Courtois.</w:t>
+      </w:r>
+    </w:p>
+    <w:p>
+      <w:pPr>
+        <w:pStyle w:val="BodyText"/>
+      </w:pPr>
+      <w:r>
+        <w:t xml:space="preserve">COURTOIS: Avec plaisir. Gratuitement, pour celle-là.</w:t>
       </w:r>
     </w:p>
     <w:p>
@@ -1568,7 +1568,7 @@
         <w:pStyle w:val="BodyText"/>
       </w:pPr>
       <w:r>
-        <w:t xml:space="preserve">VASSEUR: Jamais. Mes patientes demandent le nom de la marque, pas le pays. Mais les médecins, eux, posent la question. Et votre réponse les rassure. Personne d’autre ne répond. C’est un avantage.</w:t>
+        <w:t xml:space="preserve">COURTOIS: Jamais. Mes patientes demandent le nom de la marque, pas le pays. Mais les médecins, eux, posent la question. Et votre réponse les rassure. Personne d’autre ne répond. C’est un avantage.</w:t>
       </w:r>
     </w:p>
     <w:p>
@@ -2587,7 +2587,7 @@
           <w:bCs/>
           <w:b/>
         </w:rPr>
-        <w:t xml:space="preserve">VASSEUR (절정·전환):</w:t>
+        <w:t xml:space="preserve">COURTOIS (절정·전환):</w:t>
       </w:r>
       <w:r>
         <w:t xml:space="preserve"> </w:t>
@@ -3589,7 +3589,7 @@
         <w:pStyle w:val="BodyText"/>
       </w:pPr>
       <w:r>
-        <w:t xml:space="preserve">이네스: 안 바쇠르 선생님. 릴의 피부과 의사. 경력 15년. 일주일에 사흘 주사해요.</w:t>
+        <w:t xml:space="preserve">이네스: 안 쿠르투아 선생님. 릴의 피부과 의사. 경력 15년. 일주일에 사흘 주사해요.</w:t>
       </w:r>
     </w:p>
     <w:p>
@@ -4041,7 +4041,7 @@
         <w:pStyle w:val="BodyText"/>
       </w:pPr>
       <w:r>
-        <w:t xml:space="preserve">바쇠르: 릴의 안 바쇠르. 2년째 스위스 브랜드 컨설턴트. 리안에 말했고, 다시 말합니다.</w:t>
+        <w:t xml:space="preserve">쿠르투아: 릴의 안 쿠르투아. 2년째 스위스 브랜드 컨설턴트. 리안에 말했고, 다시 말합니다.</w:t>
       </w:r>
     </w:p>
     <w:p>
@@ -4081,7 +4081,7 @@
         <w:pStyle w:val="BodyText"/>
       </w:pPr>
       <w:r>
-        <w:t xml:space="preserve">바쇠르: 그럼 불편한 것부터. 설명서가 너무 길어서 읽히지 않고, 정작 중요한 혈관 폐색에 대해선 너무 짧아요. 그게 사람을 죽이거나 살리는 부분이에요.</w:t>
+        <w:t xml:space="preserve">쿠르투아: 그럼 불편한 것부터. 설명서가 너무 길어서 읽히지 않고, 정작 중요한 혈관 폐색에 대해선 너무 짧아요. 그게 사람을 죽이거나 살리는 부분이에요.</w:t>
       </w:r>
     </w:p>
     <w:p>
@@ -4097,7 +4097,7 @@
         <w:pStyle w:val="BodyText"/>
       </w:pPr>
       <w:r>
-        <w:t xml:space="preserve">바쇠르: 요구사항은 그렇죠. 하지만 저녁에 아파하는 환자 앞의 젊은 의사는 명확한 한 장을 원해요. 어떤 징후, 무엇을, 어떤 순서로. 법률 문단이 아니라.</w:t>
+        <w:t xml:space="preserve">쿠르투아: 요구사항은 그렇죠. 하지만 저녁에 아파하는 환자 앞의 젊은 의사는 명확한 한 장을 원해요. 어떤 징후, 무엇을, 어떤 순서로. 법률 문단이 아니라.</w:t>
       </w:r>
     </w:p>
     <w:p>
@@ -4121,15 +4121,15 @@
         <w:pStyle w:val="BodyText"/>
       </w:pPr>
       <w:r>
-        <w:t xml:space="preserve">바스티앵: 카미유와 같이 쓸게요. 그리고 바쇠르 선생님이 검토해 주세요.</w:t>
-      </w:r>
-    </w:p>
-    <w:p>
-      <w:pPr>
-        <w:pStyle w:val="BodyText"/>
-      </w:pPr>
-      <w:r>
-        <w:t xml:space="preserve">바쇠르: 기꺼이요. 그건 무료로요.</w:t>
+        <w:t xml:space="preserve">바스티앵: 카미유와 같이 쓸게요. 그리고 쿠르투아 선생님이 검토해 주세요.</w:t>
+      </w:r>
+    </w:p>
+    <w:p>
+      <w:pPr>
+        <w:pStyle w:val="BodyText"/>
+      </w:pPr>
+      <w:r>
+        <w:t xml:space="preserve">쿠르투아: 기꺼이요. 그건 무료로요.</w:t>
       </w:r>
     </w:p>
     <w:p>
@@ -4201,7 +4201,7 @@
         <w:pStyle w:val="BodyText"/>
       </w:pPr>
       <w:r>
-        <w:t xml:space="preserve">바쇠르: 전혀요. 환자들은 브랜드 이름을 묻지, 나라를 묻지 않아요. 하지만 의사들은 물어요. 그리고 여러분 대답이 안심을 줘요. 다른 회사는 아무도 답하지 않으니까요. 그게 강점이에요.</w:t>
+        <w:t xml:space="preserve">쿠르투아: 전혀요. 환자들은 브랜드 이름을 묻지, 나라를 묻지 않아요. 하지만 의사들은 물어요. 그리고 여러분 대답이 안심을 줘요. 다른 회사는 아무도 답하지 않으니까요. 그게 강점이에요.</w:t>
       </w:r>
     </w:p>
     <w:p>

</xml_diff>